<commit_message>
Update evaluation report with EDA and outputs
</commit_message>
<xml_diff>
--- a/docs/Evaluation Report.docx
+++ b/docs/Evaluation Report.docx
@@ -21,17 +21,7 @@
           <w:sz w:val="44"/>
           <w:szCs w:val="44"/>
         </w:rPr>
-        <w:t>Evaluation</w:t>
-      </w:r>
-      <w:r>
-        <w:rPr>
-          <w:rFonts w:ascii="Times New Roman" w:hAnsi="Times New Roman" w:cs="Times New Roman"/>
-          <w:b/>
-          <w:bCs/>
-          <w:sz w:val="44"/>
-          <w:szCs w:val="44"/>
-        </w:rPr>
-        <w:t xml:space="preserve"> Report</w:t>
+        <w:t>Evaluation Report</w:t>
       </w:r>
     </w:p>
     <w:p>
@@ -596,6 +586,16 @@
         <w:jc w:val="both"/>
         <w:rPr>
           <w:rFonts w:ascii="Times New Roman" w:hAnsi="Times New Roman" w:cs="Times New Roman"/>
+          <w:sz w:val="24"/>
+          <w:szCs w:val="24"/>
+        </w:rPr>
+      </w:pPr>
+    </w:p>
+    <w:p>
+      <w:pPr>
+        <w:jc w:val="both"/>
+        <w:rPr>
+          <w:rFonts w:ascii="Times New Roman" w:hAnsi="Times New Roman" w:cs="Times New Roman"/>
           <w:b/>
           <w:bCs/>
           <w:sz w:val="28"/>
@@ -783,6 +783,7 @@
                 <w:sz w:val="24"/>
                 <w:szCs w:val="24"/>
               </w:rPr>
+              <w:lastRenderedPageBreak/>
               <w:t>Transactions tested</w:t>
             </w:r>
           </w:p>
@@ -837,7 +838,6 @@
                 <w:sz w:val="24"/>
                 <w:szCs w:val="24"/>
               </w:rPr>
-              <w:lastRenderedPageBreak/>
               <w:t>Transactions flagged</w:t>
             </w:r>
           </w:p>
@@ -1718,6 +1718,7 @@
           <w:sz w:val="24"/>
           <w:szCs w:val="24"/>
         </w:rPr>
+        <w:lastRenderedPageBreak/>
         <w:t>The results were:</w:t>
       </w:r>
     </w:p>
@@ -1757,7 +1758,6 @@
                 <w:sz w:val="24"/>
                 <w:szCs w:val="24"/>
               </w:rPr>
-              <w:lastRenderedPageBreak/>
               <w:t>Model</w:t>
             </w:r>
           </w:p>
@@ -3235,6 +3235,7 @@
           <w:sz w:val="24"/>
           <w:szCs w:val="24"/>
         </w:rPr>
+        <w:lastRenderedPageBreak/>
         <w:t xml:space="preserve">F1-Score </w:t>
       </w:r>
     </w:p>
@@ -3257,7 +3258,6 @@
           <w:sz w:val="24"/>
           <w:szCs w:val="24"/>
         </w:rPr>
-        <w:lastRenderedPageBreak/>
         <w:t xml:space="preserve">Number of fraud cases detected </w:t>
       </w:r>
     </w:p>
@@ -4311,6 +4311,7 @@
           <w:sz w:val="28"/>
           <w:szCs w:val="28"/>
         </w:rPr>
+        <w:lastRenderedPageBreak/>
         <w:t>11. Conclusion</w:t>
       </w:r>
     </w:p>
@@ -4329,7 +4330,6 @@
           <w:sz w:val="24"/>
           <w:szCs w:val="24"/>
         </w:rPr>
-        <w:lastRenderedPageBreak/>
         <w:t>The evaluation demonstrates that the Autoencoder was the strongest of the three evaluated unsupervised models.</w:t>
       </w:r>
     </w:p>
@@ -4552,6 +4552,1658 @@
         <w:jc w:val="both"/>
         <w:rPr>
           <w:rFonts w:ascii="Times New Roman" w:hAnsi="Times New Roman" w:cs="Times New Roman"/>
+          <w:b/>
+          <w:bCs/>
+          <w:sz w:val="24"/>
+          <w:szCs w:val="24"/>
+        </w:rPr>
+      </w:pPr>
+      <w:r>
+        <w:rPr>
+          <w:rFonts w:ascii="Times New Roman" w:hAnsi="Times New Roman" w:cs="Times New Roman"/>
+          <w:b/>
+          <w:bCs/>
+          <w:sz w:val="24"/>
+          <w:szCs w:val="24"/>
+        </w:rPr>
+        <w:t>Exploratory Data Analysis</w:t>
+      </w:r>
+      <w:r>
+        <w:rPr>
+          <w:rFonts w:ascii="Times New Roman" w:hAnsi="Times New Roman" w:cs="Times New Roman"/>
+          <w:b/>
+          <w:bCs/>
+          <w:sz w:val="24"/>
+          <w:szCs w:val="24"/>
+        </w:rPr>
+        <w:t>-EDA</w:t>
+      </w:r>
+    </w:p>
+    <w:p>
+      <w:pPr>
+        <w:jc w:val="both"/>
+        <w:rPr>
+          <w:rFonts w:ascii="Times New Roman" w:hAnsi="Times New Roman" w:cs="Times New Roman"/>
+          <w:b/>
+          <w:bCs/>
+          <w:sz w:val="24"/>
+          <w:szCs w:val="24"/>
+        </w:rPr>
+      </w:pPr>
+      <w:r>
+        <w:rPr>
+          <w:rFonts w:ascii="Times New Roman" w:hAnsi="Times New Roman" w:cs="Times New Roman"/>
+          <w:b/>
+          <w:bCs/>
+          <w:sz w:val="24"/>
+          <w:szCs w:val="24"/>
+        </w:rPr>
+        <w:t>1.Dataset Understanding</w:t>
+      </w:r>
+    </w:p>
+    <w:p>
+      <w:pPr>
+        <w:jc w:val="both"/>
+        <w:rPr>
+          <w:rFonts w:ascii="Times New Roman" w:hAnsi="Times New Roman" w:cs="Times New Roman"/>
+          <w:b/>
+          <w:bCs/>
+          <w:sz w:val="24"/>
+          <w:szCs w:val="24"/>
+        </w:rPr>
+      </w:pPr>
+    </w:p>
+    <w:p>
+      <w:pPr>
+        <w:jc w:val="both"/>
+        <w:rPr>
+          <w:rFonts w:ascii="Times New Roman" w:hAnsi="Times New Roman" w:cs="Times New Roman"/>
+          <w:b/>
+          <w:bCs/>
+          <w:sz w:val="24"/>
+          <w:szCs w:val="24"/>
+        </w:rPr>
+      </w:pPr>
+      <w:r>
+        <w:rPr>
+          <w:rFonts w:ascii="Times New Roman" w:hAnsi="Times New Roman" w:cs="Times New Roman"/>
+          <w:b/>
+          <w:bCs/>
+          <w:sz w:val="24"/>
+          <w:szCs w:val="24"/>
+        </w:rPr>
+        <w:drawing>
+          <wp:inline distT="0" distB="0" distL="0" distR="0" wp14:anchorId="7C6BE9F1" wp14:editId="447C659D">
+            <wp:extent cx="5731510" cy="3786505"/>
+            <wp:effectExtent l="0" t="0" r="2540" b="4445"/>
+            <wp:docPr id="511828915" name="Picture 1"/>
+            <wp:cNvGraphicFramePr>
+              <a:graphicFrameLocks xmlns:a="http://schemas.openxmlformats.org/drawingml/2006/main" noChangeAspect="1"/>
+            </wp:cNvGraphicFramePr>
+            <a:graphic xmlns:a="http://schemas.openxmlformats.org/drawingml/2006/main">
+              <a:graphicData uri="http://schemas.openxmlformats.org/drawingml/2006/picture">
+                <pic:pic xmlns:pic="http://schemas.openxmlformats.org/drawingml/2006/picture">
+                  <pic:nvPicPr>
+                    <pic:cNvPr id="511828915" name=""/>
+                    <pic:cNvPicPr/>
+                  </pic:nvPicPr>
+                  <pic:blipFill>
+                    <a:blip r:embed="rId5"/>
+                    <a:stretch>
+                      <a:fillRect/>
+                    </a:stretch>
+                  </pic:blipFill>
+                  <pic:spPr>
+                    <a:xfrm>
+                      <a:off x="0" y="0"/>
+                      <a:ext cx="5731510" cy="3786505"/>
+                    </a:xfrm>
+                    <a:prstGeom prst="rect">
+                      <a:avLst/>
+                    </a:prstGeom>
+                  </pic:spPr>
+                </pic:pic>
+              </a:graphicData>
+            </a:graphic>
+          </wp:inline>
+        </w:drawing>
+      </w:r>
+    </w:p>
+    <w:p>
+      <w:pPr>
+        <w:jc w:val="both"/>
+        <w:rPr>
+          <w:rFonts w:ascii="Times New Roman" w:hAnsi="Times New Roman" w:cs="Times New Roman"/>
+          <w:b/>
+          <w:bCs/>
+          <w:sz w:val="24"/>
+          <w:szCs w:val="24"/>
+        </w:rPr>
+      </w:pPr>
+      <w:r>
+        <w:rPr>
+          <w:rFonts w:ascii="Times New Roman" w:hAnsi="Times New Roman" w:cs="Times New Roman"/>
+          <w:b/>
+          <w:bCs/>
+          <w:sz w:val="24"/>
+          <w:szCs w:val="24"/>
+        </w:rPr>
+        <w:lastRenderedPageBreak/>
+        <w:drawing>
+          <wp:inline distT="0" distB="0" distL="0" distR="0" wp14:anchorId="358AE26A" wp14:editId="26E4D729">
+            <wp:extent cx="5775960" cy="4991100"/>
+            <wp:effectExtent l="0" t="0" r="0" b="0"/>
+            <wp:docPr id="170785160" name="Picture 1"/>
+            <wp:cNvGraphicFramePr>
+              <a:graphicFrameLocks xmlns:a="http://schemas.openxmlformats.org/drawingml/2006/main" noChangeAspect="1"/>
+            </wp:cNvGraphicFramePr>
+            <a:graphic xmlns:a="http://schemas.openxmlformats.org/drawingml/2006/main">
+              <a:graphicData uri="http://schemas.openxmlformats.org/drawingml/2006/picture">
+                <pic:pic xmlns:pic="http://schemas.openxmlformats.org/drawingml/2006/picture">
+                  <pic:nvPicPr>
+                    <pic:cNvPr id="170785160" name=""/>
+                    <pic:cNvPicPr/>
+                  </pic:nvPicPr>
+                  <pic:blipFill>
+                    <a:blip r:embed="rId6"/>
+                    <a:stretch>
+                      <a:fillRect/>
+                    </a:stretch>
+                  </pic:blipFill>
+                  <pic:spPr>
+                    <a:xfrm>
+                      <a:off x="0" y="0"/>
+                      <a:ext cx="5776463" cy="4991535"/>
+                    </a:xfrm>
+                    <a:prstGeom prst="rect">
+                      <a:avLst/>
+                    </a:prstGeom>
+                  </pic:spPr>
+                </pic:pic>
+              </a:graphicData>
+            </a:graphic>
+          </wp:inline>
+        </w:drawing>
+      </w:r>
+    </w:p>
+    <w:p>
+      <w:pPr>
+        <w:jc w:val="both"/>
+        <w:rPr>
+          <w:rFonts w:ascii="Times New Roman" w:hAnsi="Times New Roman" w:cs="Times New Roman"/>
+          <w:b/>
+          <w:bCs/>
+          <w:sz w:val="24"/>
+          <w:szCs w:val="24"/>
+        </w:rPr>
+      </w:pPr>
+    </w:p>
+    <w:p>
+      <w:pPr>
+        <w:jc w:val="both"/>
+        <w:rPr>
+          <w:rFonts w:ascii="Times New Roman" w:hAnsi="Times New Roman" w:cs="Times New Roman"/>
+          <w:b/>
+          <w:bCs/>
+          <w:sz w:val="24"/>
+          <w:szCs w:val="24"/>
+        </w:rPr>
+      </w:pPr>
+      <w:r>
+        <w:rPr>
+          <w:rFonts w:ascii="Times New Roman" w:hAnsi="Times New Roman" w:cs="Times New Roman"/>
+          <w:b/>
+          <w:bCs/>
+          <w:sz w:val="24"/>
+          <w:szCs w:val="24"/>
+        </w:rPr>
+        <w:drawing>
+          <wp:inline distT="0" distB="0" distL="0" distR="0" wp14:anchorId="0C1263EC" wp14:editId="52AACBFF">
+            <wp:extent cx="5731510" cy="3253740"/>
+            <wp:effectExtent l="0" t="0" r="2540" b="3810"/>
+            <wp:docPr id="845526085" name="Picture 1"/>
+            <wp:cNvGraphicFramePr>
+              <a:graphicFrameLocks xmlns:a="http://schemas.openxmlformats.org/drawingml/2006/main" noChangeAspect="1"/>
+            </wp:cNvGraphicFramePr>
+            <a:graphic xmlns:a="http://schemas.openxmlformats.org/drawingml/2006/main">
+              <a:graphicData uri="http://schemas.openxmlformats.org/drawingml/2006/picture">
+                <pic:pic xmlns:pic="http://schemas.openxmlformats.org/drawingml/2006/picture">
+                  <pic:nvPicPr>
+                    <pic:cNvPr id="845526085" name=""/>
+                    <pic:cNvPicPr/>
+                  </pic:nvPicPr>
+                  <pic:blipFill>
+                    <a:blip r:embed="rId7"/>
+                    <a:stretch>
+                      <a:fillRect/>
+                    </a:stretch>
+                  </pic:blipFill>
+                  <pic:spPr>
+                    <a:xfrm>
+                      <a:off x="0" y="0"/>
+                      <a:ext cx="5731510" cy="3253740"/>
+                    </a:xfrm>
+                    <a:prstGeom prst="rect">
+                      <a:avLst/>
+                    </a:prstGeom>
+                  </pic:spPr>
+                </pic:pic>
+              </a:graphicData>
+            </a:graphic>
+          </wp:inline>
+        </w:drawing>
+      </w:r>
+    </w:p>
+    <w:p>
+      <w:pPr>
+        <w:jc w:val="both"/>
+        <w:rPr>
+          <w:rFonts w:ascii="Times New Roman" w:hAnsi="Times New Roman" w:cs="Times New Roman"/>
+          <w:b/>
+          <w:bCs/>
+          <w:sz w:val="24"/>
+          <w:szCs w:val="24"/>
+        </w:rPr>
+      </w:pPr>
+      <w:r>
+        <w:rPr>
+          <w:rFonts w:ascii="Times New Roman" w:hAnsi="Times New Roman" w:cs="Times New Roman"/>
+          <w:b/>
+          <w:bCs/>
+          <w:sz w:val="24"/>
+          <w:szCs w:val="24"/>
+        </w:rPr>
+        <w:lastRenderedPageBreak/>
+        <w:drawing>
+          <wp:inline distT="0" distB="0" distL="0" distR="0" wp14:anchorId="5F6D27DE" wp14:editId="4D70A187">
+            <wp:extent cx="5731510" cy="3463925"/>
+            <wp:effectExtent l="0" t="0" r="2540" b="3175"/>
+            <wp:docPr id="965202014" name="Picture 1"/>
+            <wp:cNvGraphicFramePr>
+              <a:graphicFrameLocks xmlns:a="http://schemas.openxmlformats.org/drawingml/2006/main" noChangeAspect="1"/>
+            </wp:cNvGraphicFramePr>
+            <a:graphic xmlns:a="http://schemas.openxmlformats.org/drawingml/2006/main">
+              <a:graphicData uri="http://schemas.openxmlformats.org/drawingml/2006/picture">
+                <pic:pic xmlns:pic="http://schemas.openxmlformats.org/drawingml/2006/picture">
+                  <pic:nvPicPr>
+                    <pic:cNvPr id="965202014" name=""/>
+                    <pic:cNvPicPr/>
+                  </pic:nvPicPr>
+                  <pic:blipFill>
+                    <a:blip r:embed="rId8"/>
+                    <a:stretch>
+                      <a:fillRect/>
+                    </a:stretch>
+                  </pic:blipFill>
+                  <pic:spPr>
+                    <a:xfrm>
+                      <a:off x="0" y="0"/>
+                      <a:ext cx="5731510" cy="3463925"/>
+                    </a:xfrm>
+                    <a:prstGeom prst="rect">
+                      <a:avLst/>
+                    </a:prstGeom>
+                  </pic:spPr>
+                </pic:pic>
+              </a:graphicData>
+            </a:graphic>
+          </wp:inline>
+        </w:drawing>
+      </w:r>
+    </w:p>
+    <w:p>
+      <w:pPr>
+        <w:jc w:val="both"/>
+        <w:rPr>
+          <w:rFonts w:ascii="Times New Roman" w:hAnsi="Times New Roman" w:cs="Times New Roman"/>
+          <w:b/>
+          <w:bCs/>
+          <w:sz w:val="24"/>
+          <w:szCs w:val="24"/>
+        </w:rPr>
+      </w:pPr>
+      <w:r>
+        <w:rPr>
+          <w:rFonts w:ascii="Times New Roman" w:hAnsi="Times New Roman" w:cs="Times New Roman"/>
+          <w:b/>
+          <w:bCs/>
+          <w:sz w:val="24"/>
+          <w:szCs w:val="24"/>
+        </w:rPr>
+        <w:drawing>
+          <wp:inline distT="0" distB="0" distL="0" distR="0" wp14:anchorId="66E8A665" wp14:editId="69DDA70B">
+            <wp:extent cx="5731510" cy="4211955"/>
+            <wp:effectExtent l="0" t="0" r="2540" b="0"/>
+            <wp:docPr id="1001874661" name="Picture 1"/>
+            <wp:cNvGraphicFramePr>
+              <a:graphicFrameLocks xmlns:a="http://schemas.openxmlformats.org/drawingml/2006/main" noChangeAspect="1"/>
+            </wp:cNvGraphicFramePr>
+            <a:graphic xmlns:a="http://schemas.openxmlformats.org/drawingml/2006/main">
+              <a:graphicData uri="http://schemas.openxmlformats.org/drawingml/2006/picture">
+                <pic:pic xmlns:pic="http://schemas.openxmlformats.org/drawingml/2006/picture">
+                  <pic:nvPicPr>
+                    <pic:cNvPr id="1001874661" name=""/>
+                    <pic:cNvPicPr/>
+                  </pic:nvPicPr>
+                  <pic:blipFill>
+                    <a:blip r:embed="rId9"/>
+                    <a:stretch>
+                      <a:fillRect/>
+                    </a:stretch>
+                  </pic:blipFill>
+                  <pic:spPr>
+                    <a:xfrm>
+                      <a:off x="0" y="0"/>
+                      <a:ext cx="5731510" cy="4211955"/>
+                    </a:xfrm>
+                    <a:prstGeom prst="rect">
+                      <a:avLst/>
+                    </a:prstGeom>
+                  </pic:spPr>
+                </pic:pic>
+              </a:graphicData>
+            </a:graphic>
+          </wp:inline>
+        </w:drawing>
+      </w:r>
+    </w:p>
+    <w:p>
+      <w:pPr>
+        <w:jc w:val="both"/>
+        <w:rPr>
+          <w:rFonts w:ascii="Times New Roman" w:hAnsi="Times New Roman" w:cs="Times New Roman"/>
+          <w:b/>
+          <w:bCs/>
+          <w:sz w:val="24"/>
+          <w:szCs w:val="24"/>
+        </w:rPr>
+      </w:pPr>
+    </w:p>
+    <w:p>
+      <w:pPr>
+        <w:jc w:val="both"/>
+        <w:rPr>
+          <w:rFonts w:ascii="Times New Roman" w:hAnsi="Times New Roman" w:cs="Times New Roman"/>
+          <w:b/>
+          <w:bCs/>
+          <w:sz w:val="24"/>
+          <w:szCs w:val="24"/>
+        </w:rPr>
+      </w:pPr>
+      <w:r>
+        <w:rPr>
+          <w:rFonts w:ascii="Times New Roman" w:hAnsi="Times New Roman" w:cs="Times New Roman"/>
+          <w:b/>
+          <w:bCs/>
+          <w:sz w:val="24"/>
+          <w:szCs w:val="24"/>
+        </w:rPr>
+        <w:lastRenderedPageBreak/>
+        <w:drawing>
+          <wp:inline distT="0" distB="0" distL="0" distR="0" wp14:anchorId="311D8AA6" wp14:editId="3B80D3C0">
+            <wp:extent cx="5684520" cy="4953000"/>
+            <wp:effectExtent l="0" t="0" r="0" b="0"/>
+            <wp:docPr id="1119123365" name="Picture 1"/>
+            <wp:cNvGraphicFramePr>
+              <a:graphicFrameLocks xmlns:a="http://schemas.openxmlformats.org/drawingml/2006/main" noChangeAspect="1"/>
+            </wp:cNvGraphicFramePr>
+            <a:graphic xmlns:a="http://schemas.openxmlformats.org/drawingml/2006/main">
+              <a:graphicData uri="http://schemas.openxmlformats.org/drawingml/2006/picture">
+                <pic:pic xmlns:pic="http://schemas.openxmlformats.org/drawingml/2006/picture">
+                  <pic:nvPicPr>
+                    <pic:cNvPr id="1119123365" name=""/>
+                    <pic:cNvPicPr/>
+                  </pic:nvPicPr>
+                  <pic:blipFill>
+                    <a:blip r:embed="rId10"/>
+                    <a:stretch>
+                      <a:fillRect/>
+                    </a:stretch>
+                  </pic:blipFill>
+                  <pic:spPr>
+                    <a:xfrm>
+                      <a:off x="0" y="0"/>
+                      <a:ext cx="5685015" cy="4953431"/>
+                    </a:xfrm>
+                    <a:prstGeom prst="rect">
+                      <a:avLst/>
+                    </a:prstGeom>
+                  </pic:spPr>
+                </pic:pic>
+              </a:graphicData>
+            </a:graphic>
+          </wp:inline>
+        </w:drawing>
+      </w:r>
+    </w:p>
+    <w:p>
+      <w:pPr>
+        <w:jc w:val="both"/>
+        <w:rPr>
+          <w:rFonts w:ascii="Times New Roman" w:hAnsi="Times New Roman" w:cs="Times New Roman"/>
+          <w:b/>
+          <w:bCs/>
+          <w:sz w:val="24"/>
+          <w:szCs w:val="24"/>
+        </w:rPr>
+      </w:pPr>
+      <w:r>
+        <w:rPr>
+          <w:rFonts w:ascii="Times New Roman" w:hAnsi="Times New Roman" w:cs="Times New Roman"/>
+          <w:b/>
+          <w:bCs/>
+          <w:sz w:val="24"/>
+          <w:szCs w:val="24"/>
+        </w:rPr>
+        <w:lastRenderedPageBreak/>
+        <w:drawing>
+          <wp:inline distT="0" distB="0" distL="0" distR="0" wp14:anchorId="09462661" wp14:editId="2BC5F465">
+            <wp:extent cx="5731510" cy="4511040"/>
+            <wp:effectExtent l="0" t="0" r="2540" b="3810"/>
+            <wp:docPr id="1128079556" name="Picture 1"/>
+            <wp:cNvGraphicFramePr>
+              <a:graphicFrameLocks xmlns:a="http://schemas.openxmlformats.org/drawingml/2006/main" noChangeAspect="1"/>
+            </wp:cNvGraphicFramePr>
+            <a:graphic xmlns:a="http://schemas.openxmlformats.org/drawingml/2006/main">
+              <a:graphicData uri="http://schemas.openxmlformats.org/drawingml/2006/picture">
+                <pic:pic xmlns:pic="http://schemas.openxmlformats.org/drawingml/2006/picture">
+                  <pic:nvPicPr>
+                    <pic:cNvPr id="1128079556" name=""/>
+                    <pic:cNvPicPr/>
+                  </pic:nvPicPr>
+                  <pic:blipFill>
+                    <a:blip r:embed="rId11"/>
+                    <a:stretch>
+                      <a:fillRect/>
+                    </a:stretch>
+                  </pic:blipFill>
+                  <pic:spPr>
+                    <a:xfrm>
+                      <a:off x="0" y="0"/>
+                      <a:ext cx="5731510" cy="4511040"/>
+                    </a:xfrm>
+                    <a:prstGeom prst="rect">
+                      <a:avLst/>
+                    </a:prstGeom>
+                  </pic:spPr>
+                </pic:pic>
+              </a:graphicData>
+            </a:graphic>
+          </wp:inline>
+        </w:drawing>
+      </w:r>
+    </w:p>
+    <w:p>
+      <w:pPr>
+        <w:jc w:val="both"/>
+        <w:rPr>
+          <w:rFonts w:ascii="Times New Roman" w:hAnsi="Times New Roman" w:cs="Times New Roman"/>
+          <w:b/>
+          <w:bCs/>
+          <w:sz w:val="24"/>
+          <w:szCs w:val="24"/>
+        </w:rPr>
+      </w:pPr>
+      <w:r>
+        <w:rPr>
+          <w:rFonts w:ascii="Times New Roman" w:hAnsi="Times New Roman" w:cs="Times New Roman"/>
+          <w:b/>
+          <w:bCs/>
+          <w:sz w:val="24"/>
+          <w:szCs w:val="24"/>
+        </w:rPr>
+        <w:drawing>
+          <wp:inline distT="0" distB="0" distL="0" distR="0" wp14:anchorId="3684B860" wp14:editId="60FB6235">
+            <wp:extent cx="5731510" cy="3224530"/>
+            <wp:effectExtent l="0" t="0" r="2540" b="0"/>
+            <wp:docPr id="797352988" name="Picture 1"/>
+            <wp:cNvGraphicFramePr>
+              <a:graphicFrameLocks xmlns:a="http://schemas.openxmlformats.org/drawingml/2006/main" noChangeAspect="1"/>
+            </wp:cNvGraphicFramePr>
+            <a:graphic xmlns:a="http://schemas.openxmlformats.org/drawingml/2006/main">
+              <a:graphicData uri="http://schemas.openxmlformats.org/drawingml/2006/picture">
+                <pic:pic xmlns:pic="http://schemas.openxmlformats.org/drawingml/2006/picture">
+                  <pic:nvPicPr>
+                    <pic:cNvPr id="797352988" name=""/>
+                    <pic:cNvPicPr/>
+                  </pic:nvPicPr>
+                  <pic:blipFill>
+                    <a:blip r:embed="rId12"/>
+                    <a:stretch>
+                      <a:fillRect/>
+                    </a:stretch>
+                  </pic:blipFill>
+                  <pic:spPr>
+                    <a:xfrm>
+                      <a:off x="0" y="0"/>
+                      <a:ext cx="5731510" cy="3224530"/>
+                    </a:xfrm>
+                    <a:prstGeom prst="rect">
+                      <a:avLst/>
+                    </a:prstGeom>
+                  </pic:spPr>
+                </pic:pic>
+              </a:graphicData>
+            </a:graphic>
+          </wp:inline>
+        </w:drawing>
+      </w:r>
+    </w:p>
+    <w:p>
+      <w:pPr>
+        <w:jc w:val="both"/>
+        <w:rPr>
+          <w:rFonts w:ascii="Times New Roman" w:hAnsi="Times New Roman" w:cs="Times New Roman"/>
+          <w:b/>
+          <w:bCs/>
+          <w:sz w:val="24"/>
+          <w:szCs w:val="24"/>
+        </w:rPr>
+      </w:pPr>
+    </w:p>
+    <w:p>
+      <w:pPr>
+        <w:jc w:val="both"/>
+        <w:rPr>
+          <w:rFonts w:ascii="Times New Roman" w:hAnsi="Times New Roman" w:cs="Times New Roman"/>
+          <w:b/>
+          <w:bCs/>
+          <w:sz w:val="24"/>
+          <w:szCs w:val="24"/>
+        </w:rPr>
+      </w:pPr>
+    </w:p>
+    <w:p>
+      <w:pPr>
+        <w:jc w:val="both"/>
+        <w:rPr>
+          <w:rFonts w:ascii="Times New Roman" w:hAnsi="Times New Roman" w:cs="Times New Roman"/>
+          <w:b/>
+          <w:bCs/>
+          <w:sz w:val="24"/>
+          <w:szCs w:val="24"/>
+        </w:rPr>
+      </w:pPr>
+    </w:p>
+    <w:p>
+      <w:pPr>
+        <w:jc w:val="both"/>
+        <w:rPr>
+          <w:rFonts w:ascii="Times New Roman" w:hAnsi="Times New Roman" w:cs="Times New Roman"/>
+          <w:b/>
+          <w:bCs/>
+          <w:sz w:val="24"/>
+          <w:szCs w:val="24"/>
+        </w:rPr>
+      </w:pPr>
+    </w:p>
+    <w:p>
+      <w:pPr>
+        <w:jc w:val="both"/>
+        <w:rPr>
+          <w:rFonts w:ascii="Times New Roman" w:hAnsi="Times New Roman" w:cs="Times New Roman"/>
+          <w:b/>
+          <w:bCs/>
+          <w:sz w:val="24"/>
+          <w:szCs w:val="24"/>
+        </w:rPr>
+      </w:pPr>
+      <w:r>
+        <w:rPr>
+          <w:rFonts w:ascii="Times New Roman" w:hAnsi="Times New Roman" w:cs="Times New Roman"/>
+          <w:b/>
+          <w:bCs/>
+          <w:sz w:val="24"/>
+          <w:szCs w:val="24"/>
+        </w:rPr>
+        <w:drawing>
+          <wp:inline distT="0" distB="0" distL="0" distR="0" wp14:anchorId="18A9D052" wp14:editId="782D7E53">
+            <wp:extent cx="5731510" cy="3017520"/>
+            <wp:effectExtent l="0" t="0" r="2540" b="0"/>
+            <wp:docPr id="1135094495" name="Picture 1"/>
+            <wp:cNvGraphicFramePr>
+              <a:graphicFrameLocks xmlns:a="http://schemas.openxmlformats.org/drawingml/2006/main" noChangeAspect="1"/>
+            </wp:cNvGraphicFramePr>
+            <a:graphic xmlns:a="http://schemas.openxmlformats.org/drawingml/2006/main">
+              <a:graphicData uri="http://schemas.openxmlformats.org/drawingml/2006/picture">
+                <pic:pic xmlns:pic="http://schemas.openxmlformats.org/drawingml/2006/picture">
+                  <pic:nvPicPr>
+                    <pic:cNvPr id="1135094495" name=""/>
+                    <pic:cNvPicPr/>
+                  </pic:nvPicPr>
+                  <pic:blipFill>
+                    <a:blip r:embed="rId13"/>
+                    <a:stretch>
+                      <a:fillRect/>
+                    </a:stretch>
+                  </pic:blipFill>
+                  <pic:spPr>
+                    <a:xfrm>
+                      <a:off x="0" y="0"/>
+                      <a:ext cx="5731510" cy="3017520"/>
+                    </a:xfrm>
+                    <a:prstGeom prst="rect">
+                      <a:avLst/>
+                    </a:prstGeom>
+                  </pic:spPr>
+                </pic:pic>
+              </a:graphicData>
+            </a:graphic>
+          </wp:inline>
+        </w:drawing>
+      </w:r>
+      <w:r>
+        <w:rPr>
+          <w:rFonts w:ascii="Times New Roman" w:hAnsi="Times New Roman" w:cs="Times New Roman"/>
+          <w:b/>
+          <w:bCs/>
+          <w:sz w:val="24"/>
+          <w:szCs w:val="24"/>
+        </w:rPr>
+        <w:drawing>
+          <wp:inline distT="0" distB="0" distL="0" distR="0" wp14:anchorId="6FD13302" wp14:editId="71360093">
+            <wp:extent cx="5731510" cy="3319780"/>
+            <wp:effectExtent l="0" t="0" r="2540" b="0"/>
+            <wp:docPr id="933302624" name="Picture 1"/>
+            <wp:cNvGraphicFramePr>
+              <a:graphicFrameLocks xmlns:a="http://schemas.openxmlformats.org/drawingml/2006/main" noChangeAspect="1"/>
+            </wp:cNvGraphicFramePr>
+            <a:graphic xmlns:a="http://schemas.openxmlformats.org/drawingml/2006/main">
+              <a:graphicData uri="http://schemas.openxmlformats.org/drawingml/2006/picture">
+                <pic:pic xmlns:pic="http://schemas.openxmlformats.org/drawingml/2006/picture">
+                  <pic:nvPicPr>
+                    <pic:cNvPr id="933302624" name=""/>
+                    <pic:cNvPicPr/>
+                  </pic:nvPicPr>
+                  <pic:blipFill>
+                    <a:blip r:embed="rId14"/>
+                    <a:stretch>
+                      <a:fillRect/>
+                    </a:stretch>
+                  </pic:blipFill>
+                  <pic:spPr>
+                    <a:xfrm>
+                      <a:off x="0" y="0"/>
+                      <a:ext cx="5731510" cy="3319780"/>
+                    </a:xfrm>
+                    <a:prstGeom prst="rect">
+                      <a:avLst/>
+                    </a:prstGeom>
+                  </pic:spPr>
+                </pic:pic>
+              </a:graphicData>
+            </a:graphic>
+          </wp:inline>
+        </w:drawing>
+      </w:r>
+    </w:p>
+    <w:p>
+      <w:pPr>
+        <w:jc w:val="both"/>
+        <w:rPr>
+          <w:rFonts w:ascii="Times New Roman" w:hAnsi="Times New Roman" w:cs="Times New Roman"/>
+          <w:b/>
+          <w:bCs/>
+          <w:sz w:val="24"/>
+          <w:szCs w:val="24"/>
+        </w:rPr>
+      </w:pPr>
+    </w:p>
+    <w:p>
+      <w:pPr>
+        <w:jc w:val="both"/>
+        <w:rPr>
+          <w:rFonts w:ascii="Times New Roman" w:hAnsi="Times New Roman" w:cs="Times New Roman"/>
+          <w:b/>
+          <w:bCs/>
+          <w:sz w:val="24"/>
+          <w:szCs w:val="24"/>
+        </w:rPr>
+      </w:pPr>
+    </w:p>
+    <w:p>
+      <w:pPr>
+        <w:jc w:val="both"/>
+        <w:rPr>
+          <w:rFonts w:ascii="Times New Roman" w:hAnsi="Times New Roman" w:cs="Times New Roman"/>
+          <w:b/>
+          <w:bCs/>
+          <w:sz w:val="24"/>
+          <w:szCs w:val="24"/>
+        </w:rPr>
+      </w:pPr>
+    </w:p>
+    <w:p>
+      <w:pPr>
+        <w:jc w:val="both"/>
+        <w:rPr>
+          <w:rFonts w:ascii="Times New Roman" w:hAnsi="Times New Roman" w:cs="Times New Roman"/>
+          <w:b/>
+          <w:bCs/>
+          <w:sz w:val="24"/>
+          <w:szCs w:val="24"/>
+        </w:rPr>
+      </w:pPr>
+    </w:p>
+    <w:p>
+      <w:pPr>
+        <w:jc w:val="both"/>
+        <w:rPr>
+          <w:rFonts w:ascii="Times New Roman" w:hAnsi="Times New Roman" w:cs="Times New Roman"/>
+          <w:b/>
+          <w:bCs/>
+          <w:sz w:val="24"/>
+          <w:szCs w:val="24"/>
+        </w:rPr>
+      </w:pPr>
+    </w:p>
+    <w:p>
+      <w:pPr>
+        <w:jc w:val="both"/>
+        <w:rPr>
+          <w:rFonts w:ascii="Times New Roman" w:hAnsi="Times New Roman" w:cs="Times New Roman"/>
+          <w:b/>
+          <w:bCs/>
+          <w:sz w:val="24"/>
+          <w:szCs w:val="24"/>
+        </w:rPr>
+      </w:pPr>
+    </w:p>
+    <w:p>
+      <w:pPr>
+        <w:jc w:val="both"/>
+        <w:rPr>
+          <w:rFonts w:ascii="Times New Roman" w:hAnsi="Times New Roman" w:cs="Times New Roman"/>
+          <w:b/>
+          <w:bCs/>
+          <w:sz w:val="24"/>
+          <w:szCs w:val="24"/>
+        </w:rPr>
+      </w:pPr>
+    </w:p>
+    <w:p>
+      <w:pPr>
+        <w:jc w:val="both"/>
+        <w:rPr>
+          <w:rFonts w:ascii="Times New Roman" w:hAnsi="Times New Roman" w:cs="Times New Roman"/>
+          <w:b/>
+          <w:bCs/>
+          <w:sz w:val="24"/>
+          <w:szCs w:val="24"/>
+        </w:rPr>
+      </w:pPr>
+      <w:r>
+        <w:rPr>
+          <w:rFonts w:ascii="Times New Roman" w:hAnsi="Times New Roman" w:cs="Times New Roman"/>
+          <w:b/>
+          <w:bCs/>
+          <w:sz w:val="24"/>
+          <w:szCs w:val="24"/>
+        </w:rPr>
+        <w:lastRenderedPageBreak/>
+        <w:t>===============================================================</w:t>
+      </w:r>
+    </w:p>
+    <w:p>
+      <w:pPr>
+        <w:jc w:val="both"/>
+        <w:rPr>
+          <w:rFonts w:ascii="Times New Roman" w:hAnsi="Times New Roman" w:cs="Times New Roman"/>
+          <w:b/>
+          <w:bCs/>
+          <w:sz w:val="24"/>
+          <w:szCs w:val="24"/>
+        </w:rPr>
+      </w:pPr>
+      <w:r>
+        <w:rPr>
+          <w:rFonts w:ascii="Times New Roman" w:hAnsi="Times New Roman" w:cs="Times New Roman"/>
+          <w:b/>
+          <w:bCs/>
+          <w:sz w:val="24"/>
+          <w:szCs w:val="24"/>
+        </w:rPr>
+        <w:t>FINAL PROJECT SUMMARY</w:t>
+      </w:r>
+    </w:p>
+    <w:p>
+      <w:pPr>
+        <w:jc w:val="both"/>
+        <w:rPr>
+          <w:rFonts w:ascii="Times New Roman" w:hAnsi="Times New Roman" w:cs="Times New Roman"/>
+          <w:b/>
+          <w:bCs/>
+          <w:sz w:val="24"/>
+          <w:szCs w:val="24"/>
+        </w:rPr>
+      </w:pPr>
+      <w:r>
+        <w:rPr>
+          <w:rFonts w:ascii="Times New Roman" w:hAnsi="Times New Roman" w:cs="Times New Roman"/>
+          <w:b/>
+          <w:bCs/>
+          <w:sz w:val="24"/>
+          <w:szCs w:val="24"/>
+        </w:rPr>
+        <w:t>===============================================================</w:t>
+      </w:r>
+    </w:p>
+    <w:p>
+      <w:pPr>
+        <w:jc w:val="both"/>
+        <w:rPr>
+          <w:rFonts w:ascii="Times New Roman" w:hAnsi="Times New Roman" w:cs="Times New Roman"/>
+          <w:b/>
+          <w:bCs/>
+          <w:sz w:val="24"/>
+          <w:szCs w:val="24"/>
+        </w:rPr>
+      </w:pPr>
+      <w:r>
+        <w:rPr>
+          <w:rFonts w:ascii="Times New Roman" w:hAnsi="Times New Roman" w:cs="Times New Roman"/>
+          <w:b/>
+          <w:bCs/>
+          <w:sz w:val="24"/>
+          <w:szCs w:val="24"/>
+        </w:rPr>
+        <w:t>DATASET</w:t>
+      </w:r>
+    </w:p>
+    <w:p>
+      <w:pPr>
+        <w:jc w:val="both"/>
+        <w:rPr>
+          <w:rFonts w:ascii="Times New Roman" w:hAnsi="Times New Roman" w:cs="Times New Roman"/>
+          <w:b/>
+          <w:bCs/>
+          <w:sz w:val="24"/>
+          <w:szCs w:val="24"/>
+        </w:rPr>
+      </w:pPr>
+      <w:r>
+        <w:rPr>
+          <w:rFonts w:ascii="Times New Roman" w:hAnsi="Times New Roman" w:cs="Times New Roman"/>
+          <w:b/>
+          <w:bCs/>
+          <w:sz w:val="24"/>
+          <w:szCs w:val="24"/>
+        </w:rPr>
+        <w:t>--------------------------------------------------------------------------------</w:t>
+      </w:r>
+    </w:p>
+    <w:p>
+      <w:pPr>
+        <w:jc w:val="both"/>
+        <w:rPr>
+          <w:rFonts w:ascii="Times New Roman" w:hAnsi="Times New Roman" w:cs="Times New Roman"/>
+          <w:b/>
+          <w:bCs/>
+          <w:sz w:val="24"/>
+          <w:szCs w:val="24"/>
+        </w:rPr>
+      </w:pPr>
+      <w:r>
+        <w:rPr>
+          <w:rFonts w:ascii="Times New Roman" w:hAnsi="Times New Roman" w:cs="Times New Roman"/>
+          <w:b/>
+          <w:bCs/>
+          <w:sz w:val="24"/>
+          <w:szCs w:val="24"/>
+        </w:rPr>
+        <w:t>Total transactions: 284,807</w:t>
+      </w:r>
+    </w:p>
+    <w:p>
+      <w:pPr>
+        <w:jc w:val="both"/>
+        <w:rPr>
+          <w:rFonts w:ascii="Times New Roman" w:hAnsi="Times New Roman" w:cs="Times New Roman"/>
+          <w:b/>
+          <w:bCs/>
+          <w:sz w:val="24"/>
+          <w:szCs w:val="24"/>
+        </w:rPr>
+      </w:pPr>
+      <w:r>
+        <w:rPr>
+          <w:rFonts w:ascii="Times New Roman" w:hAnsi="Times New Roman" w:cs="Times New Roman"/>
+          <w:b/>
+          <w:bCs/>
+          <w:sz w:val="24"/>
+          <w:szCs w:val="24"/>
+        </w:rPr>
+        <w:t>Normal transactions: 284,315</w:t>
+      </w:r>
+    </w:p>
+    <w:p>
+      <w:pPr>
+        <w:jc w:val="both"/>
+        <w:rPr>
+          <w:rFonts w:ascii="Times New Roman" w:hAnsi="Times New Roman" w:cs="Times New Roman"/>
+          <w:b/>
+          <w:bCs/>
+          <w:sz w:val="24"/>
+          <w:szCs w:val="24"/>
+        </w:rPr>
+      </w:pPr>
+      <w:r>
+        <w:rPr>
+          <w:rFonts w:ascii="Times New Roman" w:hAnsi="Times New Roman" w:cs="Times New Roman"/>
+          <w:b/>
+          <w:bCs/>
+          <w:sz w:val="24"/>
+          <w:szCs w:val="24"/>
+        </w:rPr>
+        <w:t>Fraud transactions: 492</w:t>
+      </w:r>
+    </w:p>
+    <w:p>
+      <w:pPr>
+        <w:jc w:val="both"/>
+        <w:rPr>
+          <w:rFonts w:ascii="Times New Roman" w:hAnsi="Times New Roman" w:cs="Times New Roman"/>
+          <w:b/>
+          <w:bCs/>
+          <w:sz w:val="24"/>
+          <w:szCs w:val="24"/>
+        </w:rPr>
+      </w:pPr>
+      <w:r>
+        <w:rPr>
+          <w:rFonts w:ascii="Times New Roman" w:hAnsi="Times New Roman" w:cs="Times New Roman"/>
+          <w:b/>
+          <w:bCs/>
+          <w:sz w:val="24"/>
+          <w:szCs w:val="24"/>
+        </w:rPr>
+        <w:t>Number of input features: 30</w:t>
+      </w:r>
+    </w:p>
+    <w:p>
+      <w:pPr>
+        <w:jc w:val="both"/>
+        <w:rPr>
+          <w:rFonts w:ascii="Times New Roman" w:hAnsi="Times New Roman" w:cs="Times New Roman"/>
+          <w:b/>
+          <w:bCs/>
+          <w:sz w:val="24"/>
+          <w:szCs w:val="24"/>
+        </w:rPr>
+      </w:pPr>
+    </w:p>
+    <w:p>
+      <w:pPr>
+        <w:jc w:val="both"/>
+        <w:rPr>
+          <w:rFonts w:ascii="Times New Roman" w:hAnsi="Times New Roman" w:cs="Times New Roman"/>
+          <w:b/>
+          <w:bCs/>
+          <w:sz w:val="24"/>
+          <w:szCs w:val="24"/>
+        </w:rPr>
+      </w:pPr>
+      <w:r>
+        <w:rPr>
+          <w:rFonts w:ascii="Times New Roman" w:hAnsi="Times New Roman" w:cs="Times New Roman"/>
+          <w:b/>
+          <w:bCs/>
+          <w:sz w:val="24"/>
+          <w:szCs w:val="24"/>
+        </w:rPr>
+        <w:t>DATA SPLIT</w:t>
+      </w:r>
+    </w:p>
+    <w:p>
+      <w:pPr>
+        <w:jc w:val="both"/>
+        <w:rPr>
+          <w:rFonts w:ascii="Times New Roman" w:hAnsi="Times New Roman" w:cs="Times New Roman"/>
+          <w:b/>
+          <w:bCs/>
+          <w:sz w:val="24"/>
+          <w:szCs w:val="24"/>
+        </w:rPr>
+      </w:pPr>
+      <w:r>
+        <w:rPr>
+          <w:rFonts w:ascii="Times New Roman" w:hAnsi="Times New Roman" w:cs="Times New Roman"/>
+          <w:b/>
+          <w:bCs/>
+          <w:sz w:val="24"/>
+          <w:szCs w:val="24"/>
+        </w:rPr>
+        <w:t>--------------------------------------------------------------------------------</w:t>
+      </w:r>
+    </w:p>
+    <w:p>
+      <w:pPr>
+        <w:jc w:val="both"/>
+        <w:rPr>
+          <w:rFonts w:ascii="Times New Roman" w:hAnsi="Times New Roman" w:cs="Times New Roman"/>
+          <w:b/>
+          <w:bCs/>
+          <w:sz w:val="24"/>
+          <w:szCs w:val="24"/>
+        </w:rPr>
+      </w:pPr>
+      <w:r>
+        <w:rPr>
+          <w:rFonts w:ascii="Times New Roman" w:hAnsi="Times New Roman" w:cs="Times New Roman"/>
+          <w:b/>
+          <w:bCs/>
+          <w:sz w:val="24"/>
+          <w:szCs w:val="24"/>
+        </w:rPr>
+        <w:t>Normal training samples: 181,960</w:t>
+      </w:r>
+    </w:p>
+    <w:p>
+      <w:pPr>
+        <w:jc w:val="both"/>
+        <w:rPr>
+          <w:rFonts w:ascii="Times New Roman" w:hAnsi="Times New Roman" w:cs="Times New Roman"/>
+          <w:b/>
+          <w:bCs/>
+          <w:sz w:val="24"/>
+          <w:szCs w:val="24"/>
+        </w:rPr>
+      </w:pPr>
+      <w:r>
+        <w:rPr>
+          <w:rFonts w:ascii="Times New Roman" w:hAnsi="Times New Roman" w:cs="Times New Roman"/>
+          <w:b/>
+          <w:bCs/>
+          <w:sz w:val="24"/>
+          <w:szCs w:val="24"/>
+        </w:rPr>
+        <w:t>Normal validation samples: 45,491</w:t>
+      </w:r>
+    </w:p>
+    <w:p>
+      <w:pPr>
+        <w:jc w:val="both"/>
+        <w:rPr>
+          <w:rFonts w:ascii="Times New Roman" w:hAnsi="Times New Roman" w:cs="Times New Roman"/>
+          <w:b/>
+          <w:bCs/>
+          <w:sz w:val="24"/>
+          <w:szCs w:val="24"/>
+        </w:rPr>
+      </w:pPr>
+      <w:r>
+        <w:rPr>
+          <w:rFonts w:ascii="Times New Roman" w:hAnsi="Times New Roman" w:cs="Times New Roman"/>
+          <w:b/>
+          <w:bCs/>
+          <w:sz w:val="24"/>
+          <w:szCs w:val="24"/>
+        </w:rPr>
+        <w:t>Held-out test samples: 56,962</w:t>
+      </w:r>
+    </w:p>
+    <w:p>
+      <w:pPr>
+        <w:jc w:val="both"/>
+        <w:rPr>
+          <w:rFonts w:ascii="Times New Roman" w:hAnsi="Times New Roman" w:cs="Times New Roman"/>
+          <w:b/>
+          <w:bCs/>
+          <w:sz w:val="24"/>
+          <w:szCs w:val="24"/>
+        </w:rPr>
+      </w:pPr>
+      <w:r>
+        <w:rPr>
+          <w:rFonts w:ascii="Times New Roman" w:hAnsi="Times New Roman" w:cs="Times New Roman"/>
+          <w:b/>
+          <w:bCs/>
+          <w:sz w:val="24"/>
+          <w:szCs w:val="24"/>
+        </w:rPr>
+        <w:t>Fraud cases in held-out test: 98</w:t>
+      </w:r>
+    </w:p>
+    <w:p>
+      <w:pPr>
+        <w:jc w:val="both"/>
+        <w:rPr>
+          <w:rFonts w:ascii="Times New Roman" w:hAnsi="Times New Roman" w:cs="Times New Roman"/>
+          <w:b/>
+          <w:bCs/>
+          <w:sz w:val="24"/>
+          <w:szCs w:val="24"/>
+        </w:rPr>
+      </w:pPr>
+    </w:p>
+    <w:p>
+      <w:pPr>
+        <w:jc w:val="both"/>
+        <w:rPr>
+          <w:rFonts w:ascii="Times New Roman" w:hAnsi="Times New Roman" w:cs="Times New Roman"/>
+          <w:b/>
+          <w:bCs/>
+          <w:sz w:val="24"/>
+          <w:szCs w:val="24"/>
+        </w:rPr>
+      </w:pPr>
+      <w:r>
+        <w:rPr>
+          <w:rFonts w:ascii="Times New Roman" w:hAnsi="Times New Roman" w:cs="Times New Roman"/>
+          <w:b/>
+          <w:bCs/>
+          <w:sz w:val="24"/>
+          <w:szCs w:val="24"/>
+        </w:rPr>
+        <w:t>AUTOENCODER</w:t>
+      </w:r>
+    </w:p>
+    <w:p>
+      <w:pPr>
+        <w:jc w:val="both"/>
+        <w:rPr>
+          <w:rFonts w:ascii="Times New Roman" w:hAnsi="Times New Roman" w:cs="Times New Roman"/>
+          <w:b/>
+          <w:bCs/>
+          <w:sz w:val="24"/>
+          <w:szCs w:val="24"/>
+        </w:rPr>
+      </w:pPr>
+      <w:r>
+        <w:rPr>
+          <w:rFonts w:ascii="Times New Roman" w:hAnsi="Times New Roman" w:cs="Times New Roman"/>
+          <w:b/>
+          <w:bCs/>
+          <w:sz w:val="24"/>
+          <w:szCs w:val="24"/>
+        </w:rPr>
+        <w:t>--------------------------------------------------------------------------------</w:t>
+      </w:r>
+    </w:p>
+    <w:p>
+      <w:pPr>
+        <w:jc w:val="both"/>
+        <w:rPr>
+          <w:rFonts w:ascii="Times New Roman" w:hAnsi="Times New Roman" w:cs="Times New Roman"/>
+          <w:b/>
+          <w:bCs/>
+          <w:sz w:val="24"/>
+          <w:szCs w:val="24"/>
+        </w:rPr>
+      </w:pPr>
+      <w:r>
+        <w:rPr>
+          <w:rFonts w:ascii="Times New Roman" w:hAnsi="Times New Roman" w:cs="Times New Roman"/>
+          <w:b/>
+          <w:bCs/>
+          <w:sz w:val="24"/>
+          <w:szCs w:val="24"/>
+        </w:rPr>
+        <w:t>Threshold percentile: 99%</w:t>
+      </w:r>
+    </w:p>
+    <w:p>
+      <w:pPr>
+        <w:jc w:val="both"/>
+        <w:rPr>
+          <w:rFonts w:ascii="Times New Roman" w:hAnsi="Times New Roman" w:cs="Times New Roman"/>
+          <w:b/>
+          <w:bCs/>
+          <w:sz w:val="24"/>
+          <w:szCs w:val="24"/>
+        </w:rPr>
+      </w:pPr>
+      <w:r>
+        <w:rPr>
+          <w:rFonts w:ascii="Times New Roman" w:hAnsi="Times New Roman" w:cs="Times New Roman"/>
+          <w:b/>
+          <w:bCs/>
+          <w:sz w:val="24"/>
+          <w:szCs w:val="24"/>
+        </w:rPr>
+        <w:t>Threshold: 0.21305744</w:t>
+      </w:r>
+    </w:p>
+    <w:p>
+      <w:pPr>
+        <w:jc w:val="both"/>
+        <w:rPr>
+          <w:rFonts w:ascii="Times New Roman" w:hAnsi="Times New Roman" w:cs="Times New Roman"/>
+          <w:b/>
+          <w:bCs/>
+          <w:sz w:val="24"/>
+          <w:szCs w:val="24"/>
+        </w:rPr>
+      </w:pPr>
+      <w:r>
+        <w:rPr>
+          <w:rFonts w:ascii="Times New Roman" w:hAnsi="Times New Roman" w:cs="Times New Roman"/>
+          <w:b/>
+          <w:bCs/>
+          <w:sz w:val="24"/>
+          <w:szCs w:val="24"/>
+        </w:rPr>
+        <w:t>Precision: 0.1269</w:t>
+      </w:r>
+    </w:p>
+    <w:p>
+      <w:pPr>
+        <w:jc w:val="both"/>
+        <w:rPr>
+          <w:rFonts w:ascii="Times New Roman" w:hAnsi="Times New Roman" w:cs="Times New Roman"/>
+          <w:b/>
+          <w:bCs/>
+          <w:sz w:val="24"/>
+          <w:szCs w:val="24"/>
+        </w:rPr>
+      </w:pPr>
+      <w:r>
+        <w:rPr>
+          <w:rFonts w:ascii="Times New Roman" w:hAnsi="Times New Roman" w:cs="Times New Roman"/>
+          <w:b/>
+          <w:bCs/>
+          <w:sz w:val="24"/>
+          <w:szCs w:val="24"/>
+        </w:rPr>
+        <w:t>Recall: 0.8367</w:t>
+      </w:r>
+    </w:p>
+    <w:p>
+      <w:pPr>
+        <w:jc w:val="both"/>
+        <w:rPr>
+          <w:rFonts w:ascii="Times New Roman" w:hAnsi="Times New Roman" w:cs="Times New Roman"/>
+          <w:b/>
+          <w:bCs/>
+          <w:sz w:val="24"/>
+          <w:szCs w:val="24"/>
+        </w:rPr>
+      </w:pPr>
+      <w:r>
+        <w:rPr>
+          <w:rFonts w:ascii="Times New Roman" w:hAnsi="Times New Roman" w:cs="Times New Roman"/>
+          <w:b/>
+          <w:bCs/>
+          <w:sz w:val="24"/>
+          <w:szCs w:val="24"/>
+        </w:rPr>
+        <w:t>F1-Score: 0.2204</w:t>
+      </w:r>
+    </w:p>
+    <w:p>
+      <w:pPr>
+        <w:jc w:val="both"/>
+        <w:rPr>
+          <w:rFonts w:ascii="Times New Roman" w:hAnsi="Times New Roman" w:cs="Times New Roman"/>
+          <w:b/>
+          <w:bCs/>
+          <w:sz w:val="24"/>
+          <w:szCs w:val="24"/>
+        </w:rPr>
+      </w:pPr>
+      <w:r>
+        <w:rPr>
+          <w:rFonts w:ascii="Times New Roman" w:hAnsi="Times New Roman" w:cs="Times New Roman"/>
+          <w:b/>
+          <w:bCs/>
+          <w:sz w:val="24"/>
+          <w:szCs w:val="24"/>
+        </w:rPr>
+        <w:t>Fraud cases detected: 82</w:t>
+      </w:r>
+    </w:p>
+    <w:p>
+      <w:pPr>
+        <w:jc w:val="both"/>
+        <w:rPr>
+          <w:rFonts w:ascii="Times New Roman" w:hAnsi="Times New Roman" w:cs="Times New Roman"/>
+          <w:b/>
+          <w:bCs/>
+          <w:sz w:val="24"/>
+          <w:szCs w:val="24"/>
+        </w:rPr>
+      </w:pPr>
+      <w:r>
+        <w:rPr>
+          <w:rFonts w:ascii="Times New Roman" w:hAnsi="Times New Roman" w:cs="Times New Roman"/>
+          <w:b/>
+          <w:bCs/>
+          <w:sz w:val="24"/>
+          <w:szCs w:val="24"/>
+        </w:rPr>
+        <w:t>Transactions flagged: 646</w:t>
+      </w:r>
+    </w:p>
+    <w:p>
+      <w:pPr>
+        <w:jc w:val="both"/>
+        <w:rPr>
+          <w:rFonts w:ascii="Times New Roman" w:hAnsi="Times New Roman" w:cs="Times New Roman"/>
+          <w:b/>
+          <w:bCs/>
+          <w:sz w:val="24"/>
+          <w:szCs w:val="24"/>
+        </w:rPr>
+      </w:pPr>
+      <w:r>
+        <w:rPr>
+          <w:rFonts w:ascii="Times New Roman" w:hAnsi="Times New Roman" w:cs="Times New Roman"/>
+          <w:b/>
+          <w:bCs/>
+          <w:sz w:val="24"/>
+          <w:szCs w:val="24"/>
+        </w:rPr>
+        <w:t>ROC-AUC: 0.9630</w:t>
+      </w:r>
+    </w:p>
+    <w:p>
+      <w:pPr>
+        <w:jc w:val="both"/>
+        <w:rPr>
+          <w:rFonts w:ascii="Times New Roman" w:hAnsi="Times New Roman" w:cs="Times New Roman"/>
+          <w:b/>
+          <w:bCs/>
+          <w:sz w:val="24"/>
+          <w:szCs w:val="24"/>
+        </w:rPr>
+      </w:pPr>
+    </w:p>
+    <w:p>
+      <w:pPr>
+        <w:jc w:val="both"/>
+        <w:rPr>
+          <w:rFonts w:ascii="Times New Roman" w:hAnsi="Times New Roman" w:cs="Times New Roman"/>
+          <w:b/>
+          <w:bCs/>
+          <w:sz w:val="24"/>
+          <w:szCs w:val="24"/>
+        </w:rPr>
+      </w:pPr>
+      <w:r>
+        <w:rPr>
+          <w:rFonts w:ascii="Times New Roman" w:hAnsi="Times New Roman" w:cs="Times New Roman"/>
+          <w:b/>
+          <w:bCs/>
+          <w:sz w:val="24"/>
+          <w:szCs w:val="24"/>
+        </w:rPr>
+        <w:t>ISOLATION FOREST</w:t>
+      </w:r>
+    </w:p>
+    <w:p>
+      <w:pPr>
+        <w:jc w:val="both"/>
+        <w:rPr>
+          <w:rFonts w:ascii="Times New Roman" w:hAnsi="Times New Roman" w:cs="Times New Roman"/>
+          <w:b/>
+          <w:bCs/>
+          <w:sz w:val="24"/>
+          <w:szCs w:val="24"/>
+        </w:rPr>
+      </w:pPr>
+      <w:r>
+        <w:rPr>
+          <w:rFonts w:ascii="Times New Roman" w:hAnsi="Times New Roman" w:cs="Times New Roman"/>
+          <w:b/>
+          <w:bCs/>
+          <w:sz w:val="24"/>
+          <w:szCs w:val="24"/>
+        </w:rPr>
+        <w:t>--------------------------------------------------------------------------------</w:t>
+      </w:r>
+    </w:p>
+    <w:p>
+      <w:pPr>
+        <w:jc w:val="both"/>
+        <w:rPr>
+          <w:rFonts w:ascii="Times New Roman" w:hAnsi="Times New Roman" w:cs="Times New Roman"/>
+          <w:b/>
+          <w:bCs/>
+          <w:sz w:val="24"/>
+          <w:szCs w:val="24"/>
+        </w:rPr>
+      </w:pPr>
+      <w:r>
+        <w:rPr>
+          <w:rFonts w:ascii="Times New Roman" w:hAnsi="Times New Roman" w:cs="Times New Roman"/>
+          <w:b/>
+          <w:bCs/>
+          <w:sz w:val="24"/>
+          <w:szCs w:val="24"/>
+        </w:rPr>
+        <w:lastRenderedPageBreak/>
+        <w:t>Precision: 0.0984</w:t>
+      </w:r>
+    </w:p>
+    <w:p>
+      <w:pPr>
+        <w:jc w:val="both"/>
+        <w:rPr>
+          <w:rFonts w:ascii="Times New Roman" w:hAnsi="Times New Roman" w:cs="Times New Roman"/>
+          <w:b/>
+          <w:bCs/>
+          <w:sz w:val="24"/>
+          <w:szCs w:val="24"/>
+        </w:rPr>
+      </w:pPr>
+      <w:r>
+        <w:rPr>
+          <w:rFonts w:ascii="Times New Roman" w:hAnsi="Times New Roman" w:cs="Times New Roman"/>
+          <w:b/>
+          <w:bCs/>
+          <w:sz w:val="24"/>
+          <w:szCs w:val="24"/>
+        </w:rPr>
+        <w:t>Recall: 0.6735</w:t>
+      </w:r>
+    </w:p>
+    <w:p>
+      <w:pPr>
+        <w:jc w:val="both"/>
+        <w:rPr>
+          <w:rFonts w:ascii="Times New Roman" w:hAnsi="Times New Roman" w:cs="Times New Roman"/>
+          <w:b/>
+          <w:bCs/>
+          <w:sz w:val="24"/>
+          <w:szCs w:val="24"/>
+        </w:rPr>
+      </w:pPr>
+      <w:r>
+        <w:rPr>
+          <w:rFonts w:ascii="Times New Roman" w:hAnsi="Times New Roman" w:cs="Times New Roman"/>
+          <w:b/>
+          <w:bCs/>
+          <w:sz w:val="24"/>
+          <w:szCs w:val="24"/>
+        </w:rPr>
+        <w:t>F1-Score: 0.1717</w:t>
+      </w:r>
+    </w:p>
+    <w:p>
+      <w:pPr>
+        <w:jc w:val="both"/>
+        <w:rPr>
+          <w:rFonts w:ascii="Times New Roman" w:hAnsi="Times New Roman" w:cs="Times New Roman"/>
+          <w:b/>
+          <w:bCs/>
+          <w:sz w:val="24"/>
+          <w:szCs w:val="24"/>
+        </w:rPr>
+      </w:pPr>
+      <w:r>
+        <w:rPr>
+          <w:rFonts w:ascii="Times New Roman" w:hAnsi="Times New Roman" w:cs="Times New Roman"/>
+          <w:b/>
+          <w:bCs/>
+          <w:sz w:val="24"/>
+          <w:szCs w:val="24"/>
+        </w:rPr>
+        <w:t>Fraud cases detected: 66</w:t>
+      </w:r>
+    </w:p>
+    <w:p>
+      <w:pPr>
+        <w:jc w:val="both"/>
+        <w:rPr>
+          <w:rFonts w:ascii="Times New Roman" w:hAnsi="Times New Roman" w:cs="Times New Roman"/>
+          <w:b/>
+          <w:bCs/>
+          <w:sz w:val="24"/>
+          <w:szCs w:val="24"/>
+        </w:rPr>
+      </w:pPr>
+    </w:p>
+    <w:p>
+      <w:pPr>
+        <w:jc w:val="both"/>
+        <w:rPr>
+          <w:rFonts w:ascii="Times New Roman" w:hAnsi="Times New Roman" w:cs="Times New Roman"/>
+          <w:b/>
+          <w:bCs/>
+          <w:sz w:val="24"/>
+          <w:szCs w:val="24"/>
+        </w:rPr>
+      </w:pPr>
+      <w:r>
+        <w:rPr>
+          <w:rFonts w:ascii="Times New Roman" w:hAnsi="Times New Roman" w:cs="Times New Roman"/>
+          <w:b/>
+          <w:bCs/>
+          <w:sz w:val="24"/>
+          <w:szCs w:val="24"/>
+        </w:rPr>
+        <w:t>ONE-CLASS SVM</w:t>
+      </w:r>
+    </w:p>
+    <w:p>
+      <w:pPr>
+        <w:jc w:val="both"/>
+        <w:rPr>
+          <w:rFonts w:ascii="Times New Roman" w:hAnsi="Times New Roman" w:cs="Times New Roman"/>
+          <w:b/>
+          <w:bCs/>
+          <w:sz w:val="24"/>
+          <w:szCs w:val="24"/>
+        </w:rPr>
+      </w:pPr>
+      <w:r>
+        <w:rPr>
+          <w:rFonts w:ascii="Times New Roman" w:hAnsi="Times New Roman" w:cs="Times New Roman"/>
+          <w:b/>
+          <w:bCs/>
+          <w:sz w:val="24"/>
+          <w:szCs w:val="24"/>
+        </w:rPr>
+        <w:t>--------------------------------------------------------------------------------</w:t>
+      </w:r>
+    </w:p>
+    <w:p>
+      <w:pPr>
+        <w:jc w:val="both"/>
+        <w:rPr>
+          <w:rFonts w:ascii="Times New Roman" w:hAnsi="Times New Roman" w:cs="Times New Roman"/>
+          <w:b/>
+          <w:bCs/>
+          <w:sz w:val="24"/>
+          <w:szCs w:val="24"/>
+        </w:rPr>
+      </w:pPr>
+      <w:r>
+        <w:rPr>
+          <w:rFonts w:ascii="Times New Roman" w:hAnsi="Times New Roman" w:cs="Times New Roman"/>
+          <w:b/>
+          <w:bCs/>
+          <w:sz w:val="24"/>
+          <w:szCs w:val="24"/>
+        </w:rPr>
+        <w:t>Precision: 0.1246</w:t>
+      </w:r>
+    </w:p>
+    <w:p>
+      <w:pPr>
+        <w:jc w:val="both"/>
+        <w:rPr>
+          <w:rFonts w:ascii="Times New Roman" w:hAnsi="Times New Roman" w:cs="Times New Roman"/>
+          <w:b/>
+          <w:bCs/>
+          <w:sz w:val="24"/>
+          <w:szCs w:val="24"/>
+        </w:rPr>
+      </w:pPr>
+      <w:r>
+        <w:rPr>
+          <w:rFonts w:ascii="Times New Roman" w:hAnsi="Times New Roman" w:cs="Times New Roman"/>
+          <w:b/>
+          <w:bCs/>
+          <w:sz w:val="24"/>
+          <w:szCs w:val="24"/>
+        </w:rPr>
+        <w:t>Recall: 0.8265</w:t>
+      </w:r>
+    </w:p>
+    <w:p>
+      <w:pPr>
+        <w:jc w:val="both"/>
+        <w:rPr>
+          <w:rFonts w:ascii="Times New Roman" w:hAnsi="Times New Roman" w:cs="Times New Roman"/>
+          <w:b/>
+          <w:bCs/>
+          <w:sz w:val="24"/>
+          <w:szCs w:val="24"/>
+        </w:rPr>
+      </w:pPr>
+      <w:r>
+        <w:rPr>
+          <w:rFonts w:ascii="Times New Roman" w:hAnsi="Times New Roman" w:cs="Times New Roman"/>
+          <w:b/>
+          <w:bCs/>
+          <w:sz w:val="24"/>
+          <w:szCs w:val="24"/>
+        </w:rPr>
+        <w:t>F1-Score: 0.2166</w:t>
+      </w:r>
+    </w:p>
+    <w:p>
+      <w:pPr>
+        <w:jc w:val="both"/>
+        <w:rPr>
+          <w:rFonts w:ascii="Times New Roman" w:hAnsi="Times New Roman" w:cs="Times New Roman"/>
+          <w:b/>
+          <w:bCs/>
+          <w:sz w:val="24"/>
+          <w:szCs w:val="24"/>
+        </w:rPr>
+      </w:pPr>
+      <w:r>
+        <w:rPr>
+          <w:rFonts w:ascii="Times New Roman" w:hAnsi="Times New Roman" w:cs="Times New Roman"/>
+          <w:b/>
+          <w:bCs/>
+          <w:sz w:val="24"/>
+          <w:szCs w:val="24"/>
+        </w:rPr>
+        <w:t>Fraud cases detected: 81</w:t>
+      </w:r>
+    </w:p>
+    <w:p>
+      <w:pPr>
+        <w:jc w:val="both"/>
+        <w:rPr>
+          <w:rFonts w:ascii="Times New Roman" w:hAnsi="Times New Roman" w:cs="Times New Roman"/>
+          <w:b/>
+          <w:bCs/>
+          <w:sz w:val="24"/>
+          <w:szCs w:val="24"/>
+        </w:rPr>
+      </w:pPr>
+    </w:p>
+    <w:p>
+      <w:pPr>
+        <w:jc w:val="both"/>
+        <w:rPr>
+          <w:rFonts w:ascii="Times New Roman" w:hAnsi="Times New Roman" w:cs="Times New Roman"/>
+          <w:b/>
+          <w:bCs/>
           <w:sz w:val="24"/>
           <w:szCs w:val="24"/>
         </w:rPr>

</xml_diff>